<commit_message>
Rehacer síntesis de educación inclusiva a partir de una lectura más completa
Co-Authored-By: Claude Opus 5.5 <noreply@anthropic.com>
Claude-Session: https://claude.ai/code/session_01UXtzB63uS75XX8xyizUANQ
</commit_message>
<xml_diff>
--- a/tareas/Sintesis_educacion_inclusiva.docx
+++ b/tareas/Sintesis_educacion_inclusiva.docx
@@ -19,7 +19,7 @@
         <w:jc w:val="both"/>
       </w:pPr>
       <w:r>
-        <w:t>Tras la lectura de los documentos, la primera idea que me queda clara es que la inclusión no es lo mismo que la integración. Integrar era colocar al alumno «diferente» en el aula ordinaria y pedirle que se adaptara; incluir supone que es la escuela la que cambia para acoger a todos, sin requisitos de entrada. Además, la inclusión no se dirige solo al alumnado con discapacidad, sino a cualquier estudiante en riesgo de exclusión por motivos sociales, culturales, económicos o de género. Como recuerda la UNESCO, un sistema que excluye no puede considerarse un sistema de calidad.</w:t>
+        <w:t>La primera idea que saco de las lecturas es que la inclusión no es lo mismo que la integración. La integración llevaba al alumno «especial» a un sistema escolar que seguía igual; la inclusión pretende reestructurar la escuela según las necesidades de todos. No se dirige solo al alumnado con discapacidad: abarca a cualquier estudiante vulnerable por género, cultura, lengua o nivel socioeconómico. Además, es un derecho reconocido en la Declaración de Salamanca y en el artículo 24 de la Convención de la ONU de 2006. La UNESCO añade que la exclusión no es solo no estar escolarizado, sino también quedarse sin experiencias de aprendizaje valiosas.</w:t>
       </w:r>
     </w:p>
     <w:p>
@@ -28,7 +28,7 @@
         <w:jc w:val="both"/>
       </w:pPr>
       <w:r>
-        <w:t>La segunda reflexión es que la inclusión es un proceso que nunca está terminado. Se mide en tres dimensiones: presencia (estar en el centro ordinario), aprendizaje (progresar al máximo de las propias capacidades) y participación (sentirse parte del grupo y valorado). La parábola del invitado a cenar lo explica muy bien: no basta con invitar, ni con servir un plato aparte; la verdadera inclusión es cambiar el menú para que todos coman juntos. Por eso hablamos de un «dilema de las diferencias»: dar a cada uno lo que necesita sin separarlo de los demás.</w:t>
+        <w:t>La segunda reflexión es el «dilema de las diferencias»: dar a cada alumno lo que necesita sin separarlo de los demás. La parábola del invitado a cenar lo resume: la escuela selectiva no lo invita, la integración le sirve un plato aparte y la escuela inclusiva cambia el menú para que todos coman juntos. Por eso la inclusión se mide en presencia, aprendizaje y participación. Con el género ya resolvimos un dilema parecido: hoy nadie discute la coeducación, aunque antes los profesores decían «no estar preparados».</w:t>
       </w:r>
     </w:p>
     <w:p>
@@ -37,7 +37,7 @@
         <w:jc w:val="both"/>
       </w:pPr>
       <w:r>
-        <w:t>En tercer lugar, el problema no está en el alumno, sino en las barreras para el aprendizaje y la participación. El Index for Inclusion propone revisar a la vez las culturas, las políticas y las prácticas del centro, porque lo que de verdad orienta la acción son las creencias profundas del profesorado. Una cultura inclusiva se basa en la colaboración docente, en escuchar la voz del alumnado y en las altas expectativas, frente al individualismo de las aulas como «cajas de huevos».</w:t>
+        <w:t>En tercer lugar, el problema no está en el alumno sino en las barreras del entorno. El Index para la Inclusión evita hablar de «necesidades educativas especiales» porque esa etiqueta rebaja las expectativas. Del mismo modo, la guía de FEVAS entiende la discapacidad intelectual como el resultado de la interacción entre la persona y su entorno. Y como esas barreras nacen de creencias profundas, el Index sitúa las culturas inclusivas en la base del cambio. También me ha parecido clave escuchar la voz del alumnado: en la Declaración de Lisboa, jóvenes con discapacidad dicen «no deseamos compasión, queremos ser considerados futuros adultos».</w:t>
       </w:r>
     </w:p>
     <w:p>
@@ -46,7 +46,7 @@
         <w:jc w:val="both"/>
       </w:pPr>
       <w:r>
-        <w:t>En el aula, la inclusión se concreta en un currículo flexible y no limitado al libro de texto, en la enseñanza multinivel, en el aprendizaje cooperativo y en el diseño universal. La guía de accesibilidad cognitiva me ha hecho ver que también el propio centro debe ser comprensible: señales, pictogramas, horarios visuales o rutinas claras benefician a todos. Y la guía de FEVAS muestra que conocer la discapacidad intelectual desarrolla empatía, respeto y amistad en todo el grupo.</w:t>
+        <w:t>En el aula, la inclusión se traduce en romper con que todos hagan lo mismo, al mismo tiempo y de la misma forma: enseñanza multinivel, aprendizaje cooperativo, Diseño Universal para el Aprendizaje y horarios y agrupamientos flexibles. La guía de accesibilidad cognitiva añade que el centro debe ser comprensible, porque un entorno que no se entiende genera ansiedad y dependencia. El proyecto INCLUD-ED aporta datos: agrupar por niveles baja el rendimiento de quien va más atrasado, mientras que los grupos heterogéneos con más adultos dentro del aula, como los grupos interactivos, mejoran los resultados de todos. También ayuda que las familias participen decidiendo y educando.</w:t>
       </w:r>
     </w:p>
     <w:p>
@@ -55,16 +55,7 @@
         <w:jc w:val="both"/>
       </w:pPr>
       <w:r>
-        <w:t>El proyecto INCLUD-ED aporta evidencias: las actuaciones de éxito, como los grupos interactivos, las tertulias dialógicas o la formación de familiares, mejoran los resultados y la convivencia, mientras que agrupar por niveles aumenta la desigualdad. La clave es que la comunidad entera participe en la escuela.</w:t>
-      </w:r>
-    </w:p>
-    <w:p>
-      <w:pPr>
-        <w:ind w:firstLine="567"/>
-        <w:jc w:val="both"/>
-      </w:pPr>
-      <w:r>
-        <w:t>Por último, como señalaba el reportaje de la revista Escuela, las leyes y las buenas intenciones no bastan: hacen falta recursos, formación del profesorado y coordinación con las familias. Mi conclusión es que la educación inclusiva es, sobre todo, una cuestión de derechos y de actitud docente: el beneficio para el alumnado con necesidades es un beneficio para todos.</w:t>
+        <w:t>Por último, el reportaje de la revista Escuela recuerda que, más de veinte años después de la LISMI, las buenas intenciones no bastan: faltan recursos, formación y datos. Mi conclusión es que la inclusión es un proceso que nunca termina («no hay ningún centro totalmente inclusivo», dice el Index) y depende sobre todo de la actitud del profesorado, que es un modelo para sus alumnos. Como dice la guía de FEVAS, es más enriquecedor plantear que todos somos diferentes que decir que todos somos iguales «excepto Pedro».</w:t>
       </w:r>
     </w:p>
     <w:sectPr>

</xml_diff>

<commit_message>
Reescribir la síntesis con voz más personal y vocabulario de los apuntes del Tema 1
Co-Authored-By: Claude Opus 5.5 <noreply@anthropic.com>
Claude-Session: https://claude.ai/code/session_01UXtzB63uS75XX8xyizUANQ
</commit_message>
<xml_diff>
--- a/tareas/Sintesis_educacion_inclusiva.docx
+++ b/tareas/Sintesis_educacion_inclusiva.docx
@@ -19,7 +19,7 @@
         <w:jc w:val="both"/>
       </w:pPr>
       <w:r>
-        <w:t>La primera idea que saco de las lecturas es que la inclusión no es lo mismo que la integración. La integración incorporaba al alumnado con discapacidad a la escuela ordinaria, pero sin cambiar nada de ella; la inclusión pretende reestructurar la escuela según las necesidades de todos. No se dirige solo al alumnado con discapacidad: abarca a cualquier estudiante vulnerable por género, cultura, lengua o nivel socioeconómico. Además, es un derecho reconocido en la Declaración de Salamanca y en el artículo 24 de la Convención de la ONU de 2006. La UNESCO añade que la exclusión no es solo no estar escolarizado, sino también quedarse sin experiencias de aprendizaje valiosas.</w:t>
+        <w:t>Antes de estas lecturas pensaba que inclusión e integración eran casi lo mismo, y no lo son. En clase vimos el recorrido de exclusión, separación, integración e inclusión, y los textos me han ayudado a entender ese último salto. Con la integración, el alumnado con NEE ya estaba en el centro ordinario, pero el sistema seguía igual y era el alumno quien tenía que encajar. La inclusión le da la vuelta: cambia la escuela, y no solo pensando en la discapacidad, sino en cualquiera que pueda quedarse fuera por su origen, su lengua o la situación de su familia. La UNESCO va más allá: también está excluido quien está matriculado pero no vive experiencias de aprendizaje que merezcan la pena.</w:t>
       </w:r>
     </w:p>
     <w:p>
@@ -28,7 +28,7 @@
         <w:jc w:val="both"/>
       </w:pPr>
       <w:r>
-        <w:t>La segunda reflexión es el «dilema de las diferencias»: dar a cada alumno lo que necesita sin separarlo de los demás. La parábola del invitado a cenar lo resume: la escuela selectiva no lo invita, la integración le sirve un plato aparte y la escuela inclusiva cambia el menú para que todos coman juntos. Por eso la inclusión se mide en presencia, aprendizaje y participación. Con el género ya resolvimos un dilema parecido: hoy nadie discute la coeducación, aunque antes los profesores decían «no estar preparados».</w:t>
+        <w:t>La parábola del invitado a cenar me pareció la forma más clara de verlo. Un anfitrión no invita a su amigo porque no puede comer de todo, otro le prepara un plato aparte y el tercero cambia el menú para que todos coman lo mismo. Me recordó a la imagen del árbol: dar a cada uno una escalera distinta es equidad, pero arreglar el árbol para que nadie la necesite es justicia. Eso busca la inclusión, y por eso se mide en presencia, aprendizaje y participación, no solo en estar sentado en el aula.</w:t>
       </w:r>
     </w:p>
     <w:p>
@@ -37,7 +37,7 @@
         <w:jc w:val="both"/>
       </w:pPr>
       <w:r>
-        <w:t>En tercer lugar, el problema no está en el alumno sino en las barreras del entorno. El Index para la Inclusión evita hablar de «necesidades educativas especiales» porque esa etiqueta rebaja las expectativas. Del mismo modo, la guía de FEVAS entiende la discapacidad intelectual como el resultado de la interacción entre la persona y su entorno. Y como esas barreras nacen de creencias profundas, el Index sitúa las culturas inclusivas en la base del cambio. También me ha parecido clave escuchar la voz del alumnado: en la Declaración de Lisboa, jóvenes con discapacidad dicen «no deseamos compasión, queremos ser considerados futuros adultos».</w:t>
+        <w:t>Casi todos los textos insisten en que el problema no está en el alumno, sino en su interacción con el contexto, que es lo que separa el modelo del déficit del modelo de la diversidad. El Index evita hablar de «necesidades educativas especiales» porque la etiqueta baja las expectativas, algo que encaja con el círculo vicioso que estudiamos: se espera menos, se enseña menos, el alumno rinde menos y la etiqueta parece confirmarse. Por eso el Index pone la cultura del centro en la base de todo. Me impactó la Declaración de Lisboa, donde jóvenes con discapacidad dicen: «no deseamos compasión».</w:t>
       </w:r>
     </w:p>
     <w:p>
@@ -46,7 +46,7 @@
         <w:jc w:val="both"/>
       </w:pPr>
       <w:r>
-        <w:t>En el aula, la inclusión se traduce en romper con que todos hagan lo mismo, al mismo tiempo y de la misma forma: enseñanza multinivel, aprendizaje cooperativo, Diseño Universal para el Aprendizaje y horarios y agrupamientos flexibles. La guía de accesibilidad cognitiva añade que el centro debe ser comprensible, porque un entorno que no se entiende genera ansiedad y dependencia. El proyecto INCLUD-ED aporta datos: agrupar por niveles baja el rendimiento de quien va más atrasado, mientras que los grupos heterogéneos con más adultos dentro del aula, como los grupos interactivos, mejoran los resultados de todos. También ayuda que las familias participen decidiendo y educando.</w:t>
+        <w:t>En el aula, se trata de romper con que todos hagan lo mismo, al mismo tiempo y de la misma manera: enseñanza multinivel, aprendizaje cooperativo, Diseño Universal para el Aprendizaje y agrupamientos flexibles. La guía de accesibilidad cognitiva me hizo pensar en algo que nunca me había planteado: un centro que no se entiende genera ansiedad y dependencia. Y el informe INCLUD-ED da datos que me sorprendieron: separar por niveles empeora los resultados de quien va más atrasado, mientras que los grupos heterogéneos con más adultos en el aula, como los grupos interactivos, mejoran los de todos.</w:t>
       </w:r>
     </w:p>
     <w:p>
@@ -55,7 +55,7 @@
         <w:jc w:val="both"/>
       </w:pPr>
       <w:r>
-        <w:t>Por último, el reportaje de la revista Escuela recuerda que, más de veinte años después de la LISMI, las buenas intenciones no bastan: faltan recursos, formación y datos. Mi conclusión es que la inclusión es un proceso que nunca termina («no hay ningún centro totalmente inclusivo», dice el Index) y depende sobre todo de la actitud del profesorado, que es un modelo para sus alumnos. Como dice la guía de FEVAS, es más enriquecedor plantear que todos somos diferentes que decir que todos somos iguales «excepto Pedro».</w:t>
+        <w:t>Aun así, no basta con la buena voluntad. El reportaje de Escuela recordaba que, más de veinte años después de la LISMI, seguían faltando recursos y formación. Pensando en mi futuro como docente de secundaria, me quedo con que la inclusión es un camino que no se acaba («no hay ningún centro totalmente inclusivo», dice el Index) y con que nuestra actitud pesa mucho. Como dice la guía de FEVAS, es más enriquecedor plantear que todos somos diferentes que decir que todos somos iguales «excepto Pedro».</w:t>
       </w:r>
     </w:p>
     <w:sectPr>

</xml_diff>

<commit_message>
Incorporar ideas y expresiones de los apuntes de clase del Tema 1
Co-Authored-By: Claude Opus 5.5 <noreply@anthropic.com>
Claude-Session: https://claude.ai/code/session_01UXtzB63uS75XX8xyizUANQ
</commit_message>
<xml_diff>
--- a/tareas/Sintesis_educacion_inclusiva.docx
+++ b/tareas/Sintesis_educacion_inclusiva.docx
@@ -19,7 +19,7 @@
         <w:jc w:val="both"/>
       </w:pPr>
       <w:r>
-        <w:t>Antes de estas lecturas pensaba que inclusión e integración eran casi lo mismo, y no lo son. En clase vimos el recorrido de exclusión, separación, integración e inclusión, y los textos me han ayudado a entender ese último salto. Con la integración, el alumnado con NEE ya estaba en el centro ordinario, pero el sistema seguía igual y era el alumno quien tenía que encajar. La inclusión le da la vuelta: cambia la escuela, y no solo pensando en la discapacidad, sino en cualquiera que pueda quedarse fuera por su origen, su lengua o la situación de su familia. La UNESCO va más allá: también está excluido quien está matriculado pero no vive experiencias de aprendizaje que merezcan la pena.</w:t>
+        <w:t>Antes de estas lecturas pensaba que inclusión e integración eran casi lo mismo, y no lo son. En clase vimos cómo se pasó de institucionalizar a las personas con discapacidad, dándoles cobijo y poco más, a la integración, en buena parte gracias a familias que querían que sus hijos fueran ciudadanos de primera y convivieran con los demás. Pero hoy seguimos, como se dijo en clase, entre la integración y la inclusión. Con la integración el alumnado con NEE ya está en el centro ordinario, pero es él quien tiene que encajar. La inclusión le da la vuelta: cambia la escuela, y no solo pensando en la discapacidad, sino en cualquiera que pueda quedarse fuera por su origen, su lengua o la situación de su familia.</w:t>
       </w:r>
     </w:p>
     <w:p>
@@ -37,7 +37,7 @@
         <w:jc w:val="both"/>
       </w:pPr>
       <w:r>
-        <w:t>Casi todos los textos insisten en que el problema no está en el alumno, sino en su interacción con el contexto, que es lo que separa el modelo del déficit del modelo de la diversidad. El Index evita hablar de «necesidades educativas especiales» porque la etiqueta baja las expectativas, algo que encaja con el círculo vicioso que estudiamos: se espera menos, se enseña menos, el alumno rinde menos y la etiqueta parece confirmarse. Por eso el Index pone la cultura del centro en la base de todo. Me impactó la Declaración de Lisboa, donde jóvenes con discapacidad dicen: «no deseamos compasión».</w:t>
+        <w:t>Casi todos los textos insisten en lo que en clase llamamos el paso del modelo clínico al pedagógico: la raíz del problema no está en el alumno, sino en su interacción con el ambiente. El Index evita hablar de «necesidades educativas especiales» porque la etiqueta baja las expectativas, y eso es la profecía autocumplida: se espera menos, se enseña menos, el alumno rinde menos y la etiqueta parece confirmarse. Me acordé del ejemplo de las faltas de ortografía, que no tienen por qué ser dislexia: a veces lo que falta es lectura. Por eso importa más saber qué sabe hacer el alumno y cómo aprende mejor que ponerle un nombre.</w:t>
       </w:r>
     </w:p>
     <w:p>
@@ -55,7 +55,7 @@
         <w:jc w:val="both"/>
       </w:pPr>
       <w:r>
-        <w:t>Aun así, no basta con la buena voluntad. El reportaje de Escuela recordaba que, más de veinte años después de la LISMI, seguían faltando recursos y formación. Pensando en mi futuro como docente de secundaria, me quedo con que la inclusión es un camino que no se acaba («no hay ningún centro totalmente inclusivo», dice el Index) y con que nuestra actitud pesa mucho. Como dice la guía de FEVAS, es más enriquecedor plantear que todos somos diferentes que decir que todos somos iguales «excepto Pedro».</w:t>
+        <w:t>Aun así, no basta con la buena voluntad. El reportaje de Escuela recordaba que, más de veinte años después de la LISMI, seguían faltando recursos y formación, y ahí cobra sentido la idea de ver la educación como una inversión y no como un gasto. Pensando en mi futuro como docente de secundaria, me quedo con que la inclusión es un camino que no se acaba («no hay ningún centro totalmente inclusivo», dice el Index). Como dice la guía de FEVAS, es más enriquecedor plantear que todos somos diferentes que decir que todos somos iguales «excepto Pedro».</w:t>
       </w:r>
     </w:p>
     <w:sectPr>

</xml_diff>